<commit_message>
deal screen: update warp.docx
</commit_message>
<xml_diff>
--- a/hub/static/research/companies/warp.docx
+++ b/hub/static/research/companies/warp.docx
@@ -3,20 +3,23 @@
 <w:document xmlns:wpc="http://schemas.microsoft.com/office/word/2010/wordprocessingCanvas" xmlns:mo="http://schemas.microsoft.com/office/mac/office/2008/main" xmlns:mc="http://schemas.openxmlformats.org/markup-compatibility/2006" xmlns:mv="urn:schemas-microsoft-com:mac:vml" xmlns:o="urn:schemas-microsoft-com:office:office" xmlns:r="http://schemas.openxmlformats.org/officeDocument/2006/relationships" xmlns:m="http://schemas.openxmlformats.org/officeDocument/2006/math" xmlns:v="urn:schemas-microsoft-com:vml" xmlns:wp14="http://schemas.microsoft.com/office/word/2010/wordprocessingDrawing" xmlns:wp="http://schemas.openxmlformats.org/drawingml/2006/wordprocessingDrawing" xmlns:w10="urn:schemas-microsoft-com:office:word" xmlns:w="http://schemas.openxmlformats.org/wordprocessingml/2006/main" xmlns:w14="http://schemas.microsoft.com/office/word/2010/wordml" xmlns:wpg="http://schemas.microsoft.com/office/word/2010/wordprocessingGroup" xmlns:wpi="http://schemas.microsoft.com/office/word/2010/wordprocessingInk" xmlns:wne="http://schemas.microsoft.com/office/word/2006/wordml" xmlns:wps="http://schemas.microsoft.com/office/word/2010/wordprocessingShape" mc:Ignorable="w14 wp14">
   <w:body>
     <w:p>
+      <w:pPr>
+        <w:spacing w:before="80" w:after="40"/>
+      </w:pPr>
       <w:r>
         <w:rPr>
           <w:rFonts w:ascii="Roboto Serif" w:hAnsi="Roboto Serif"/>
           <w:b/>
           <w:caps w:val="0"/>
           <w:color w:val="1A1A1A"/>
-          <w:sz w:val="48"/>
+          <w:sz w:val="44"/>
         </w:rPr>
-        <w:t>Warp</w:t>
+        <w:t>Warp (Business/Productivity Software)</w:t>
       </w:r>
     </w:p>
     <w:p>
       <w:pPr>
-        <w:spacing w:after="80"/>
+        <w:spacing w:after="40"/>
       </w:pPr>
       <w:r>
         <w:rPr>
@@ -24,18 +27,10 @@
           <w:b w:val="0"/>
           <w:caps w:val="0"/>
           <w:color w:val="828282"/>
-          <w:sz w:val="22"/>
+          <w:sz w:val="21"/>
         </w:rPr>
         <w:t>warp.co   ·   Series B   ·   New York, NY   ·   Battery Ventures</w:t>
       </w:r>
-    </w:p>
-    <w:p>
-      <w:pPr>
-        <w:spacing w:after="320"/>
-        <w:pBdr>
-          <w:bottom w:val="single" w:sz="6" w:color="1A1A1A" w:space="4"/>
-        </w:pBdr>
-      </w:pPr>
     </w:p>
     <w:p>
       <w:pPr>
@@ -43,13 +38,46 @@
       </w:pPr>
       <w:r>
         <w:rPr>
+          <w:rFonts w:ascii="Sora" w:hAnsi="Sora"/>
+          <w:b w:val="0"/>
+          <w:caps w:val="0"/>
+          <w:color w:val="828282"/>
+          <w:sz w:val="18"/>
+        </w:rPr>
+        <w:t>Screened 2026-06-29</w:t>
+      </w:r>
+    </w:p>
+    <w:p>
+      <w:pPr>
+        <w:spacing w:after="120"/>
+        <w:pBdr>
+          <w:bottom w:val="single" w:sz="6" w:color="1A1A1A" w:space="4"/>
+        </w:pBdr>
+      </w:pPr>
+      <w:r>
+        <w:rPr>
           <w:rFonts w:ascii="Roboto Serif" w:hAnsi="Roboto Serif"/>
           <w:b/>
           <w:caps w:val="0"/>
           <w:color w:val="1A1A1A"/>
-          <w:sz w:val="30"/>
+          <w:sz w:val="28"/>
         </w:rPr>
-        <w:t>Fit score 2.8 / 4.0</w:t>
+        <w:t>FIT ASSESSMENT</w:t>
+      </w:r>
+    </w:p>
+    <w:p>
+      <w:pPr>
+        <w:spacing w:before="120" w:after="240"/>
+      </w:pPr>
+      <w:r>
+        <w:rPr>
+          <w:rFonts w:ascii="Roboto Serif" w:hAnsi="Roboto Serif"/>
+          <w:b/>
+          <w:caps w:val="0"/>
+          <w:color w:val="1A1A1A"/>
+          <w:sz w:val="32"/>
+        </w:rPr>
+        <w:t>2.6 / 4.0</w:t>
       </w:r>
       <w:r>
         <w:rPr>
@@ -69,20 +97,21 @@
         <w:tblLook w:firstColumn="1" w:firstRow="1" w:lastColumn="0" w:lastRow="0" w:noHBand="0" w:noVBand="1" w:val="04A0"/>
       </w:tblPr>
       <w:tblGrid>
-        <w:gridCol w:w="3216"/>
-        <w:gridCol w:w="3216"/>
-        <w:gridCol w:w="3216"/>
+        <w:gridCol w:w="3120"/>
+        <w:gridCol w:w="3120"/>
+        <w:gridCol w:w="3120"/>
       </w:tblGrid>
       <w:tr>
         <w:tc>
           <w:tcPr>
-            <w:tcW w:type="dxa" w:w="2736"/>
-            <w:tcBorders>
-              <w:top w:val="nil"/>
-              <w:left w:val="nil"/>
-              <w:right w:val="nil"/>
-              <w:bottom w:val="single" w:sz="8" w:color="1A1A1A"/>
-            </w:tcBorders>
+            <w:tcW w:type="dxa" w:w="2664"/>
+            <w:shd w:val="clear" w:color="auto" w:fill="1A1A1A"/>
+            <w:tcMar>
+              <w:top w:w="40" w:type="dxa"/>
+              <w:bottom w:w="40" w:type="dxa"/>
+              <w:left w:w="60" w:type="dxa"/>
+              <w:right w:w="60" w:type="dxa"/>
+            </w:tcMar>
           </w:tcPr>
           <w:p>
             <w:r>
@@ -90,8 +119,8 @@
                 <w:rFonts w:ascii="Sora" w:hAnsi="Sora"/>
                 <w:b/>
                 <w:caps/>
-                <w:color w:val="1A1A1A"/>
-                <w:sz w:val="17"/>
+                <w:color w:val="FFFFFF"/>
+                <w:sz w:val="18"/>
               </w:rPr>
               <w:t>Dimension</w:t>
             </w:r>
@@ -99,13 +128,14 @@
         </w:tc>
         <w:tc>
           <w:tcPr>
-            <w:tcW w:type="dxa" w:w="864"/>
-            <w:tcBorders>
-              <w:top w:val="nil"/>
-              <w:left w:val="nil"/>
-              <w:right w:val="nil"/>
-              <w:bottom w:val="single" w:sz="8" w:color="1A1A1A"/>
-            </w:tcBorders>
+            <w:tcW w:type="dxa" w:w="792"/>
+            <w:shd w:val="clear" w:color="auto" w:fill="1A1A1A"/>
+            <w:tcMar>
+              <w:top w:w="40" w:type="dxa"/>
+              <w:bottom w:w="40" w:type="dxa"/>
+              <w:left w:w="60" w:type="dxa"/>
+              <w:right w:w="60" w:type="dxa"/>
+            </w:tcMar>
           </w:tcPr>
           <w:p>
             <w:r>
@@ -113,8 +143,8 @@
                 <w:rFonts w:ascii="Sora" w:hAnsi="Sora"/>
                 <w:b/>
                 <w:caps/>
-                <w:color w:val="1A1A1A"/>
-                <w:sz w:val="17"/>
+                <w:color w:val="FFFFFF"/>
+                <w:sz w:val="18"/>
               </w:rPr>
               <w:t>Score</w:t>
             </w:r>
@@ -122,13 +152,14 @@
         </w:tc>
         <w:tc>
           <w:tcPr>
-            <w:tcW w:type="dxa" w:w="6336"/>
-            <w:tcBorders>
-              <w:top w:val="nil"/>
-              <w:left w:val="nil"/>
-              <w:right w:val="nil"/>
-              <w:bottom w:val="single" w:sz="8" w:color="1A1A1A"/>
-            </w:tcBorders>
+            <w:tcW w:type="dxa" w:w="5904"/>
+            <w:shd w:val="clear" w:color="auto" w:fill="1A1A1A"/>
+            <w:tcMar>
+              <w:top w:w="40" w:type="dxa"/>
+              <w:bottom w:w="40" w:type="dxa"/>
+              <w:left w:w="60" w:type="dxa"/>
+              <w:right w:w="60" w:type="dxa"/>
+            </w:tcMar>
           </w:tcPr>
           <w:p>
             <w:r>
@@ -136,8 +167,8 @@
                 <w:rFonts w:ascii="Sora" w:hAnsi="Sora"/>
                 <w:b/>
                 <w:caps/>
-                <w:color w:val="1A1A1A"/>
-                <w:sz w:val="17"/>
+                <w:color w:val="FFFFFF"/>
+                <w:sz w:val="18"/>
               </w:rPr>
               <w:t>Evidence</w:t>
             </w:r>
@@ -147,7 +178,14 @@
       <w:tr>
         <w:tc>
           <w:tcPr>
-            <w:tcW w:type="dxa" w:w="2736"/>
+            <w:tcW w:type="dxa" w:w="2664"/>
+            <w:shd w:val="clear" w:color="auto" w:fill="F5F5F5"/>
+            <w:tcMar>
+              <w:top w:w="40" w:type="dxa"/>
+              <w:bottom w:w="40" w:type="dxa"/>
+              <w:left w:w="60" w:type="dxa"/>
+              <w:right w:w="60" w:type="dxa"/>
+            </w:tcMar>
             <w:tcBorders>
               <w:top w:val="nil"/>
               <w:left w:val="nil"/>
@@ -170,7 +208,14 @@
         </w:tc>
         <w:tc>
           <w:tcPr>
-            <w:tcW w:type="dxa" w:w="864"/>
+            <w:tcW w:type="dxa" w:w="792"/>
+            <w:shd w:val="clear" w:color="auto" w:fill="F5F5F5"/>
+            <w:tcMar>
+              <w:top w:w="40" w:type="dxa"/>
+              <w:bottom w:w="40" w:type="dxa"/>
+              <w:left w:w="60" w:type="dxa"/>
+              <w:right w:w="60" w:type="dxa"/>
+            </w:tcMar>
             <w:tcBorders>
               <w:top w:val="nil"/>
               <w:left w:val="nil"/>
@@ -182,18 +227,35 @@
             <w:r>
               <w:rPr>
                 <w:rFonts w:ascii="Sora" w:hAnsi="Sora"/>
-                <w:b w:val="0"/>
+                <w:b/>
                 <w:caps w:val="0"/>
                 <w:color w:val="1A1A1A"/>
                 <w:sz w:val="19"/>
               </w:rPr>
               <w:t>3</w:t>
             </w:r>
+            <w:r>
+              <w:rPr>
+                <w:rFonts w:ascii="Sora" w:hAnsi="Sora"/>
+                <w:b w:val="0"/>
+                <w:caps w:val="0"/>
+                <w:color w:val="828282"/>
+                <w:sz w:val="17"/>
+              </w:rPr>
+              <w:t xml:space="preserve"> / 4</w:t>
+            </w:r>
           </w:p>
         </w:tc>
         <w:tc>
           <w:tcPr>
-            <w:tcW w:type="dxa" w:w="6336"/>
+            <w:tcW w:type="dxa" w:w="5904"/>
+            <w:shd w:val="clear" w:color="auto" w:fill="F5F5F5"/>
+            <w:tcMar>
+              <w:top w:w="40" w:type="dxa"/>
+              <w:bottom w:w="40" w:type="dxa"/>
+              <w:left w:w="60" w:type="dxa"/>
+              <w:right w:w="60" w:type="dxa"/>
+            </w:tcMar>
             <w:tcBorders>
               <w:top w:val="nil"/>
               <w:left w:val="nil"/>
@@ -210,7 +272,7 @@
                 <w:color w:val="3C3C3C"/>
                 <w:sz w:val="18"/>
               </w:rPr>
-              <w:t xml:space="preserve">Warp announced a $60M </w:t>
+              <w:t xml:space="preserve">Warp announced a $60M Series B </w:t>
             </w:r>
             <w:r>
               <w:rPr>
@@ -220,7 +282,7 @@
                 <w:color w:val="3C3C3C"/>
                 <w:sz w:val="18"/>
               </w:rPr>
-              <w:t>Series B</w:t>
+              <w:t>led by Battery Ventures</w:t>
             </w:r>
             <w:r>
               <w:rPr>
@@ -230,7 +292,7 @@
                 <w:color w:val="3C3C3C"/>
                 <w:sz w:val="18"/>
               </w:rPr>
-              <w:t xml:space="preserve"> led by Battery Ventures, with participation from Peak XV, Sound Ventures, and Y Combinator, bringing total funding to $85M in under a year.[1][5] Battery Ventures is a long-standing top-tier global VC; this is a primary new-money Series B led by a top-tier firm (no evidence it was an insider/previous lead), which fits the 'near-top-tier new-money Series B+, top-tier syndicate' band.[1][5][2]</w:t>
+              <w:t>, with participation from Peak XV, Sound Ventures, and Y Combinator.[1][6] Battery Ventures is generally regarded as a top-tier growth investor, and this is a primary new-money Series B (not framed as an insider extension), but none of the sources explicitly state whether Battery was a prior investor, so conservatively this fits the 'near-top-tier new-money Series B+, top-tier syndicate' band rather than a clearly documented new-money Tier 1 lead.[1][5][6]</w:t>
             </w:r>
           </w:p>
         </w:tc>
@@ -238,7 +300,14 @@
       <w:tr>
         <w:tc>
           <w:tcPr>
-            <w:tcW w:type="dxa" w:w="2736"/>
+            <w:tcW w:type="dxa" w:w="2664"/>
+            <w:shd w:val="clear" w:color="auto" w:fill="FFFFFF"/>
+            <w:tcMar>
+              <w:top w:w="40" w:type="dxa"/>
+              <w:bottom w:w="40" w:type="dxa"/>
+              <w:left w:w="60" w:type="dxa"/>
+              <w:right w:w="60" w:type="dxa"/>
+            </w:tcMar>
             <w:tcBorders>
               <w:top w:val="nil"/>
               <w:left w:val="nil"/>
@@ -261,7 +330,14 @@
         </w:tc>
         <w:tc>
           <w:tcPr>
-            <w:tcW w:type="dxa" w:w="864"/>
+            <w:tcW w:type="dxa" w:w="792"/>
+            <w:shd w:val="clear" w:color="auto" w:fill="FFFFFF"/>
+            <w:tcMar>
+              <w:top w:w="40" w:type="dxa"/>
+              <w:bottom w:w="40" w:type="dxa"/>
+              <w:left w:w="60" w:type="dxa"/>
+              <w:right w:w="60" w:type="dxa"/>
+            </w:tcMar>
             <w:tcBorders>
               <w:top w:val="nil"/>
               <w:left w:val="nil"/>
@@ -273,18 +349,35 @@
             <w:r>
               <w:rPr>
                 <w:rFonts w:ascii="Sora" w:hAnsi="Sora"/>
-                <w:b w:val="0"/>
+                <w:b/>
                 <w:caps w:val="0"/>
                 <w:color w:val="1A1A1A"/>
                 <w:sz w:val="19"/>
               </w:rPr>
               <w:t>4</w:t>
             </w:r>
+            <w:r>
+              <w:rPr>
+                <w:rFonts w:ascii="Sora" w:hAnsi="Sora"/>
+                <w:b w:val="0"/>
+                <w:caps w:val="0"/>
+                <w:color w:val="828282"/>
+                <w:sz w:val="17"/>
+              </w:rPr>
+              <w:t xml:space="preserve"> / 4</w:t>
+            </w:r>
           </w:p>
         </w:tc>
         <w:tc>
           <w:tcPr>
-            <w:tcW w:type="dxa" w:w="6336"/>
+            <w:tcW w:type="dxa" w:w="5904"/>
+            <w:shd w:val="clear" w:color="auto" w:fill="FFFFFF"/>
+            <w:tcMar>
+              <w:top w:w="40" w:type="dxa"/>
+              <w:bottom w:w="40" w:type="dxa"/>
+              <w:left w:w="60" w:type="dxa"/>
+              <w:right w:w="60" w:type="dxa"/>
+            </w:tcMar>
             <w:tcBorders>
               <w:top w:val="nil"/>
               <w:left w:val="nil"/>
@@ -301,7 +394,7 @@
                 <w:color w:val="3C3C3C"/>
                 <w:sz w:val="18"/>
               </w:rPr>
-              <w:t xml:space="preserve">Warp describes itself as an </w:t>
+              <w:t xml:space="preserve">Warp is described as an </w:t>
             </w:r>
             <w:r>
               <w:rPr>
@@ -311,7 +404,7 @@
                 <w:color w:val="3C3C3C"/>
                 <w:sz w:val="18"/>
               </w:rPr>
-              <w:t>AI-native human capital management platform</w:t>
+              <w:t>AI-native payroll, compliance, and benefits platform</w:t>
             </w:r>
             <w:r>
               <w:rPr>
@@ -321,7 +414,7 @@
                 <w:color w:val="3C3C3C"/>
                 <w:sz w:val="18"/>
               </w:rPr>
-              <w:t xml:space="preserve"> and an AI-native employee management startup focused on automating payroll, compliance, and HR with AI.[4][5] Fundz similarly notes Warp is expanding its 'AI-driven payroll and HR platform.'[2] AI is clearly the core of the product and value prop, consistent with a pure-play AI score.</w:t>
+              <w:t xml:space="preserve"> and an AI-native human capital management (HCM) platform, rebuilding HR and payroll with AI.[2][6] Multiple sources emphasize AI as the core of the product ("AI-native"), indicating that AI is central to the value proposition rather than a peripheral feature, consistent with a pure-play AI score.[2][3][6]</w:t>
             </w:r>
           </w:p>
         </w:tc>
@@ -329,7 +422,14 @@
       <w:tr>
         <w:tc>
           <w:tcPr>
-            <w:tcW w:type="dxa" w:w="2736"/>
+            <w:tcW w:type="dxa" w:w="2664"/>
+            <w:shd w:val="clear" w:color="auto" w:fill="F5F5F5"/>
+            <w:tcMar>
+              <w:top w:w="40" w:type="dxa"/>
+              <w:bottom w:w="40" w:type="dxa"/>
+              <w:left w:w="60" w:type="dxa"/>
+              <w:right w:w="60" w:type="dxa"/>
+            </w:tcMar>
             <w:tcBorders>
               <w:top w:val="nil"/>
               <w:left w:val="nil"/>
@@ -352,7 +452,14 @@
         </w:tc>
         <w:tc>
           <w:tcPr>
-            <w:tcW w:type="dxa" w:w="864"/>
+            <w:tcW w:type="dxa" w:w="792"/>
+            <w:shd w:val="clear" w:color="auto" w:fill="F5F5F5"/>
+            <w:tcMar>
+              <w:top w:w="40" w:type="dxa"/>
+              <w:bottom w:w="40" w:type="dxa"/>
+              <w:left w:w="60" w:type="dxa"/>
+              <w:right w:w="60" w:type="dxa"/>
+            </w:tcMar>
             <w:tcBorders>
               <w:top w:val="nil"/>
               <w:left w:val="nil"/>
@@ -364,18 +471,35 @@
             <w:r>
               <w:rPr>
                 <w:rFonts w:ascii="Sora" w:hAnsi="Sora"/>
-                <w:b w:val="0"/>
+                <w:b/>
                 <w:caps w:val="0"/>
                 <w:color w:val="1A1A1A"/>
                 <w:sz w:val="19"/>
               </w:rPr>
               <w:t>2</w:t>
             </w:r>
+            <w:r>
+              <w:rPr>
+                <w:rFonts w:ascii="Sora" w:hAnsi="Sora"/>
+                <w:b w:val="0"/>
+                <w:caps w:val="0"/>
+                <w:color w:val="828282"/>
+                <w:sz w:val="17"/>
+              </w:rPr>
+              <w:t xml:space="preserve"> / 4</w:t>
+            </w:r>
           </w:p>
         </w:tc>
         <w:tc>
           <w:tcPr>
-            <w:tcW w:type="dxa" w:w="6336"/>
+            <w:tcW w:type="dxa" w:w="5904"/>
+            <w:shd w:val="clear" w:color="auto" w:fill="F5F5F5"/>
+            <w:tcMar>
+              <w:top w:w="40" w:type="dxa"/>
+              <w:bottom w:w="40" w:type="dxa"/>
+              <w:left w:w="60" w:type="dxa"/>
+              <w:right w:w="60" w:type="dxa"/>
+            </w:tcMar>
             <w:tcBorders>
               <w:top w:val="nil"/>
               <w:left w:val="nil"/>
@@ -392,7 +516,27 @@
                 <w:color w:val="3C3C3C"/>
                 <w:sz w:val="18"/>
               </w:rPr>
-              <w:t>Public sources emphasize 'significant growth and success in revenue and client volume' but do not disclose concrete figures for revenue, growth, NDR, LTV/CAC, or burn.[2][4][5] Given a rapid follow-on from Series A to a sizable Series B in under a year and language about strong traction, fundamentals are likely above the rubric’s weakest bucket but there is insufficient data to justify the &gt;$25M / &gt;70% growth bar for a 3, so a conservative mid score is appropriate.</w:t>
+              <w:t xml:space="preserve">Public sources highlight that Warp has seen "significant growth and success in revenue and client volume" but provide </w:t>
+            </w:r>
+            <w:r>
+              <w:rPr>
+                <w:rFonts w:ascii="Sora" w:hAnsi="Sora"/>
+                <w:b/>
+                <w:caps w:val="0"/>
+                <w:color w:val="3C3C3C"/>
+                <w:sz w:val="18"/>
+              </w:rPr>
+              <w:t>no concrete revenue, growth rate, NDR, LTV/CAC, or burn metrics</w:t>
+            </w:r>
+            <w:r>
+              <w:rPr>
+                <w:rFonts w:ascii="Sora" w:hAnsi="Sora"/>
+                <w:b w:val="0"/>
+                <w:caps w:val="0"/>
+                <w:color w:val="3C3C3C"/>
+                <w:sz w:val="18"/>
+              </w:rPr>
+              <w:t>.[3] The company raised $60M Series B and has $85M total funding in under a year after its Series A, suggesting strong momentum but not enough quantified data to justify the ≥$25M revenue and ≥70% growth bar for a 3; in the absence of hard metrics, a cautious mid-range score between weak fundamentals (1) and the strong quantitative bar (3) is appropriate.[1][3][6]</w:t>
             </w:r>
           </w:p>
         </w:tc>
@@ -400,7 +544,14 @@
       <w:tr>
         <w:tc>
           <w:tcPr>
-            <w:tcW w:type="dxa" w:w="2736"/>
+            <w:tcW w:type="dxa" w:w="2664"/>
+            <w:shd w:val="clear" w:color="auto" w:fill="FFFFFF"/>
+            <w:tcMar>
+              <w:top w:w="40" w:type="dxa"/>
+              <w:bottom w:w="40" w:type="dxa"/>
+              <w:left w:w="60" w:type="dxa"/>
+              <w:right w:w="60" w:type="dxa"/>
+            </w:tcMar>
             <w:tcBorders>
               <w:top w:val="nil"/>
               <w:left w:val="nil"/>
@@ -423,7 +574,14 @@
         </w:tc>
         <w:tc>
           <w:tcPr>
-            <w:tcW w:type="dxa" w:w="864"/>
+            <w:tcW w:type="dxa" w:w="792"/>
+            <w:shd w:val="clear" w:color="auto" w:fill="FFFFFF"/>
+            <w:tcMar>
+              <w:top w:w="40" w:type="dxa"/>
+              <w:bottom w:w="40" w:type="dxa"/>
+              <w:left w:w="60" w:type="dxa"/>
+              <w:right w:w="60" w:type="dxa"/>
+            </w:tcMar>
             <w:tcBorders>
               <w:top w:val="nil"/>
               <w:left w:val="nil"/>
@@ -435,18 +593,35 @@
             <w:r>
               <w:rPr>
                 <w:rFonts w:ascii="Sora" w:hAnsi="Sora"/>
-                <w:b w:val="0"/>
+                <w:b/>
                 <w:caps w:val="0"/>
                 <w:color w:val="1A1A1A"/>
                 <w:sz w:val="19"/>
               </w:rPr>
               <w:t>3</w:t>
             </w:r>
+            <w:r>
+              <w:rPr>
+                <w:rFonts w:ascii="Sora" w:hAnsi="Sora"/>
+                <w:b w:val="0"/>
+                <w:caps w:val="0"/>
+                <w:color w:val="828282"/>
+                <w:sz w:val="17"/>
+              </w:rPr>
+              <w:t xml:space="preserve"> / 4</w:t>
+            </w:r>
           </w:p>
         </w:tc>
         <w:tc>
           <w:tcPr>
-            <w:tcW w:type="dxa" w:w="6336"/>
+            <w:tcW w:type="dxa" w:w="5904"/>
+            <w:shd w:val="clear" w:color="auto" w:fill="FFFFFF"/>
+            <w:tcMar>
+              <w:top w:w="40" w:type="dxa"/>
+              <w:bottom w:w="40" w:type="dxa"/>
+              <w:left w:w="60" w:type="dxa"/>
+              <w:right w:w="60" w:type="dxa"/>
+            </w:tcMar>
             <w:tcBorders>
               <w:top w:val="nil"/>
               <w:left w:val="nil"/>
@@ -463,7 +638,27 @@
                 <w:color w:val="3C3C3C"/>
                 <w:sz w:val="18"/>
               </w:rPr>
-              <w:t>Warp targets the large HR/payroll/HCM market with an AI-native platform, aiming to 'rebuild HR software with AI' and automate payroll, compliance, and HR—categories with historically large outcomes (e.g., Workday, ADP peers).[4][5][2] The combination of a sizable Series B led by a top-tier investor and AI differentiation suggests potential for &gt;3x outcomes with meaningful execution and competitive risk; available data is not strong enough to underwrite &gt;7x with little risk.</w:t>
+              <w:t xml:space="preserve">Warp operates in large, durable markets (payroll, HR, compliance, benefits) and positions itself as an </w:t>
+            </w:r>
+            <w:r>
+              <w:rPr>
+                <w:rFonts w:ascii="Sora" w:hAnsi="Sora"/>
+                <w:b/>
+                <w:caps w:val="0"/>
+                <w:color w:val="3C3C3C"/>
+                <w:sz w:val="18"/>
+              </w:rPr>
+              <w:t>AI-native HCM/payroll platform</w:t>
+            </w:r>
+            <w:r>
+              <w:rPr>
+                <w:rFonts w:ascii="Sora" w:hAnsi="Sora"/>
+                <w:b w:val="0"/>
+                <w:caps w:val="0"/>
+                <w:color w:val="3C3C3C"/>
+                <w:sz w:val="18"/>
+              </w:rPr>
+              <w:t>, which supports a meaningful upside if execution is strong.[2][6] The rapid follow-on from Series A to a $60M Series B and backing by Battery Ventures and other notable investors imply expectations of material growth and scale, consistent with &gt;3x potential but still with meaningful risk of capital loss given limited public fundamentals.[1][3][5][6]</w:t>
             </w:r>
           </w:p>
         </w:tc>
@@ -471,7 +666,14 @@
       <w:tr>
         <w:tc>
           <w:tcPr>
-            <w:tcW w:type="dxa" w:w="2736"/>
+            <w:tcW w:type="dxa" w:w="2664"/>
+            <w:shd w:val="clear" w:color="auto" w:fill="F5F5F5"/>
+            <w:tcMar>
+              <w:top w:w="40" w:type="dxa"/>
+              <w:bottom w:w="40" w:type="dxa"/>
+              <w:left w:w="60" w:type="dxa"/>
+              <w:right w:w="60" w:type="dxa"/>
+            </w:tcMar>
             <w:tcBorders>
               <w:top w:val="nil"/>
               <w:left w:val="nil"/>
@@ -494,7 +696,14 @@
         </w:tc>
         <w:tc>
           <w:tcPr>
-            <w:tcW w:type="dxa" w:w="864"/>
+            <w:tcW w:type="dxa" w:w="792"/>
+            <w:shd w:val="clear" w:color="auto" w:fill="F5F5F5"/>
+            <w:tcMar>
+              <w:top w:w="40" w:type="dxa"/>
+              <w:bottom w:w="40" w:type="dxa"/>
+              <w:left w:w="60" w:type="dxa"/>
+              <w:right w:w="60" w:type="dxa"/>
+            </w:tcMar>
             <w:tcBorders>
               <w:top w:val="nil"/>
               <w:left w:val="nil"/>
@@ -506,18 +715,35 @@
             <w:r>
               <w:rPr>
                 <w:rFonts w:ascii="Sora" w:hAnsi="Sora"/>
-                <w:b w:val="0"/>
+                <w:b/>
                 <w:caps w:val="0"/>
                 <w:color w:val="1A1A1A"/>
                 <w:sz w:val="19"/>
               </w:rPr>
-              <w:t>2</w:t>
+              <w:t>1</w:t>
+            </w:r>
+            <w:r>
+              <w:rPr>
+                <w:rFonts w:ascii="Sora" w:hAnsi="Sora"/>
+                <w:b w:val="0"/>
+                <w:caps w:val="0"/>
+                <w:color w:val="828282"/>
+                <w:sz w:val="17"/>
+              </w:rPr>
+              <w:t xml:space="preserve"> / 4</w:t>
             </w:r>
           </w:p>
         </w:tc>
         <w:tc>
           <w:tcPr>
-            <w:tcW w:type="dxa" w:w="6336"/>
+            <w:tcW w:type="dxa" w:w="5904"/>
+            <w:shd w:val="clear" w:color="auto" w:fill="F5F5F5"/>
+            <w:tcMar>
+              <w:top w:w="40" w:type="dxa"/>
+              <w:bottom w:w="40" w:type="dxa"/>
+              <w:left w:w="60" w:type="dxa"/>
+              <w:right w:w="60" w:type="dxa"/>
+            </w:tcMar>
             <w:tcBorders>
               <w:top w:val="nil"/>
               <w:left w:val="nil"/>
@@ -534,7 +760,27 @@
                 <w:color w:val="3C3C3C"/>
                 <w:sz w:val="18"/>
               </w:rPr>
-              <w:t>No public information is available on SPV structure, carry, fees, time horizon, or data access for the allocation ID8 might get into this Battery-led Series B.[1][2][5] In the absence of explicit terms but assuming a standard growth round with typical economics, a cautious mid-low score is appropriate rather than assuming ideal 0/10 SPV economics.</w:t>
+              <w:t xml:space="preserve">No public information is available on the SPV structure, carry, management fees, time horizon, or data access for an ID8 participation in this round.[1][2][3][6] With </w:t>
+            </w:r>
+            <w:r>
+              <w:rPr>
+                <w:rFonts w:ascii="Sora" w:hAnsi="Sora"/>
+                <w:b/>
+                <w:caps w:val="0"/>
+                <w:color w:val="3C3C3C"/>
+                <w:sz w:val="18"/>
+              </w:rPr>
+              <w:t>no deal-specific terms data</w:t>
+            </w:r>
+            <w:r>
+              <w:rPr>
+                <w:rFonts w:ascii="Sora" w:hAnsi="Sora"/>
+                <w:b w:val="0"/>
+                <w:caps w:val="0"/>
+                <w:color w:val="3C3C3C"/>
+                <w:sz w:val="18"/>
+              </w:rPr>
+              <w:t xml:space="preserve"> to evaluate against the rubric, this dimension must be scored at the lowest level per the instruction to treat missing evidence as a low score.</w:t>
             </w:r>
           </w:p>
         </w:tc>
@@ -542,24 +788,30 @@
     </w:tbl>
     <w:p>
       <w:pPr>
-        <w:spacing w:after="80"/>
+        <w:spacing w:after="160"/>
       </w:pPr>
     </w:p>
     <w:p>
+      <w:pPr>
+        <w:spacing w:after="120"/>
+        <w:pBdr>
+          <w:bottom w:val="single" w:sz="6" w:color="1A1A1A" w:space="4"/>
+        </w:pBdr>
+      </w:pPr>
       <w:r>
         <w:rPr>
-          <w:rFonts w:ascii="Sora" w:hAnsi="Sora"/>
+          <w:rFonts w:ascii="Roboto Serif" w:hAnsi="Roboto Serif"/>
           <w:b/>
-          <w:caps/>
-          <w:color w:val="828282"/>
-          <w:sz w:val="17"/>
+          <w:caps w:val="0"/>
+          <w:color w:val="1A1A1A"/>
+          <w:sz w:val="24"/>
         </w:rPr>
         <w:t>RATIONALE</w:t>
       </w:r>
     </w:p>
     <w:p>
       <w:pPr>
-        <w:spacing w:after="360"/>
+        <w:spacing w:before="120" w:after="120"/>
         <w:jc w:val="both"/>
       </w:pPr>
       <w:r>
@@ -570,7 +822,7 @@
           <w:color w:val="1A1A1A"/>
           <w:sz w:val="21"/>
         </w:rPr>
-        <w:t xml:space="preserve">Warp passes both gates: it is raising a </w:t>
+        <w:t xml:space="preserve">Warp passes the stage and geography gates: it is raising a </w:t>
       </w:r>
       <w:r>
         <w:rPr>
@@ -590,85 +842,168 @@
           <w:color w:val="1A1A1A"/>
           <w:sz w:val="21"/>
         </w:rPr>
-        <w:t xml:space="preserve"> round and is headquartered in New York City, a developed North American market.[2][5] The deal is meaningfully aligned with ID8’s thesis: it is a primary, new-money </w:t>
-      </w:r>
-      <w:r>
-        <w:rPr>
-          <w:rFonts w:ascii="Sora" w:hAnsi="Sora"/>
-          <w:b/>
-          <w:caps w:val="0"/>
-          <w:color w:val="1A1A1A"/>
-          <w:sz w:val="21"/>
-        </w:rPr>
-        <w:t>Series B</w:t>
-      </w:r>
-      <w:r>
-        <w:rPr>
-          <w:rFonts w:ascii="Sora" w:hAnsi="Sora"/>
-          <w:b w:val="0"/>
-          <w:caps w:val="0"/>
-          <w:color w:val="1A1A1A"/>
-          <w:sz w:val="21"/>
-        </w:rPr>
-        <w:t xml:space="preserve"> led by a top-tier investor (Battery Ventures) that appears on the cap table as a new lead rather than an insider extension.[1][5] Overall fit is solid on lead/risk/AI exposure, but fundamentals and economics cannot be fully validated from public data, so the deal looks attractive but not yet in the very-high-confidence tier without direct metrics and term sheets.</w:t>
+        <w:t xml:space="preserve"> round and is headquartered in New York, NY.[1][3][6] The deal is backed by Battery Ventures, a Tier 1 growth investor, and appears to be a primary Series B with a strong syndicate, but available sources do not clearly confirm whether Battery is truly new-money to the cap table, so alignment with ID8’s core thesis (new-money Tier 1 lead joining for the first time) is partial rather than clearly validated.[1][5][6] Overall, Warp looks like a promising AI-native HR/payroll platform with strong investor quality and market, but the lack of detailed financial metrics and deal terms data limits confidence in fit and pushes several rubric scores down.</w:t>
       </w:r>
     </w:p>
     <w:p>
+      <w:pPr>
+        <w:spacing w:before="80"/>
+      </w:pPr>
       <w:r>
         <w:rPr>
           <w:rFonts w:ascii="Sora" w:hAnsi="Sora"/>
           <w:b w:val="0"/>
           <w:caps w:val="0"/>
           <w:color w:val="828282"/>
-          <w:sz w:val="17"/>
+          <w:sz w:val="18"/>
         </w:rPr>
-        <w:t>Confidence: medium   ·   Screened 2026-06-29   ·   ID8 Investments — Confidential</w:t>
-      </w:r>
-    </w:p>
-    <w:p>
-      <w:r>
-        <w:drawing>
-          <wp:inline xmlns:a="http://schemas.openxmlformats.org/drawingml/2006/main" xmlns:pic="http://schemas.openxmlformats.org/drawingml/2006/picture">
-            <wp:extent cx="731520" cy="72277"/>
-            <wp:docPr id="1" name="Picture 1"/>
-            <wp:cNvGraphicFramePr>
-              <a:graphicFrameLocks noChangeAspect="1"/>
-            </wp:cNvGraphicFramePr>
-            <a:graphic>
-              <a:graphicData uri="http://schemas.openxmlformats.org/drawingml/2006/picture">
-                <pic:pic>
-                  <pic:nvPicPr>
-                    <pic:cNvPr id="0" name="id8_charcoal.png"/>
-                    <pic:cNvPicPr/>
-                  </pic:nvPicPr>
-                  <pic:blipFill>
-                    <a:blip r:embed="rId9"/>
-                    <a:stretch>
-                      <a:fillRect/>
-                    </a:stretch>
-                  </pic:blipFill>
-                  <pic:spPr>
-                    <a:xfrm>
-                      <a:off x="0" y="0"/>
-                      <a:ext cx="731520" cy="72277"/>
-                    </a:xfrm>
-                    <a:prstGeom prst="rect"/>
-                  </pic:spPr>
-                </pic:pic>
-              </a:graphicData>
-            </a:graphic>
-          </wp:inline>
-        </w:drawing>
+        <w:t>Confidence: medium</w:t>
       </w:r>
     </w:p>
     <w:sectPr>
+      <w:footerReference w:type="default" r:id="rId9"/>
+      <w:headerReference w:type="default" r:id="rId10"/>
       <w:pgSz w:w="12240" w:h="15840"/>
-      <w:pgMar w:top="1080" w:right="1296" w:bottom="1080" w:left="1296" w:header="720" w:footer="720" w:gutter="0"/>
+      <w:pgMar w:top="1440" w:right="1440" w:bottom="1440" w:left="1440" w:header="720" w:footer="720" w:gutter="0"/>
       <w:cols w:space="720"/>
       <w:docGrid w:linePitch="360"/>
     </w:sectPr>
   </w:body>
 </w:document>
+</file>
+
+<file path=word/footer1.xml><?xml version="1.0" encoding="utf-8"?>
+<w:ftr xmlns:m="http://schemas.openxmlformats.org/officeDocument/2006/math" xmlns:mc="http://schemas.openxmlformats.org/markup-compatibility/2006" xmlns:mo="http://schemas.microsoft.com/office/mac/office/2008/main" xmlns:mv="urn:schemas-microsoft-com:mac:vml" xmlns:o="urn:schemas-microsoft-com:office:office" xmlns:r="http://schemas.openxmlformats.org/officeDocument/2006/relationships" xmlns:v="urn:schemas-microsoft-com:vml" xmlns:w10="urn:schemas-microsoft-com:office:word" xmlns:w14="http://schemas.microsoft.com/office/word/2010/wordml" xmlns:w="http://schemas.openxmlformats.org/wordprocessingml/2006/main" xmlns:wne="http://schemas.microsoft.com/office/word/2006/wordml" xmlns:wp14="http://schemas.microsoft.com/office/word/2010/wordprocessingDrawing" xmlns:wp="http://schemas.openxmlformats.org/drawingml/2006/wordprocessingDrawing" xmlns:wpc="http://schemas.microsoft.com/office/word/2010/wordprocessingCanvas" xmlns:wpg="http://schemas.microsoft.com/office/word/2010/wordprocessingGroup" xmlns:wpi="http://schemas.microsoft.com/office/word/2010/wordprocessingInk" xmlns:wps="http://schemas.microsoft.com/office/word/2010/wordprocessingShape" mc:Ignorable="w14 wp14">
+  <w:p>
+    <w:pPr>
+      <w:pStyle w:val="Footer"/>
+      <w:jc w:val="center"/>
+    </w:pPr>
+    <w:r>
+      <w:rPr>
+        <w:rFonts w:ascii="Sora" w:hAnsi="Sora"/>
+        <w:b w:val="0"/>
+        <w:caps w:val="0"/>
+        <w:color w:val="828282"/>
+        <w:sz w:val="17"/>
+      </w:rPr>
+      <w:t xml:space="preserve">Page </w:t>
+    </w:r>
+    <w:fldChar w:fldCharType="begin"/>
+    <w:instrText xml:space="preserve"> PAGE </w:instrText>
+    <w:fldChar w:fldCharType="end"/>
+    <w:r>
+      <w:rPr>
+        <w:rFonts w:ascii="Sora" w:hAnsi="Sora"/>
+        <w:b w:val="0"/>
+        <w:caps w:val="0"/>
+        <w:color w:val="828282"/>
+        <w:sz w:val="17"/>
+      </w:rPr>
+      <w:t xml:space="preserve"> of </w:t>
+    </w:r>
+    <w:fldChar w:fldCharType="begin"/>
+    <w:instrText xml:space="preserve"> NUMPAGES </w:instrText>
+    <w:fldChar w:fldCharType="end"/>
+  </w:p>
+</w:ftr>
+</file>
+
+<file path=word/header1.xml><?xml version="1.0" encoding="utf-8"?>
+<w:hdr xmlns:m="http://schemas.openxmlformats.org/officeDocument/2006/math" xmlns:mc="http://schemas.openxmlformats.org/markup-compatibility/2006" xmlns:mo="http://schemas.microsoft.com/office/mac/office/2008/main" xmlns:mv="urn:schemas-microsoft-com:mac:vml" xmlns:o="urn:schemas-microsoft-com:office:office" xmlns:r="http://schemas.openxmlformats.org/officeDocument/2006/relationships" xmlns:v="urn:schemas-microsoft-com:vml" xmlns:w10="urn:schemas-microsoft-com:office:word" xmlns:w14="http://schemas.microsoft.com/office/word/2010/wordml" xmlns:w="http://schemas.openxmlformats.org/wordprocessingml/2006/main" xmlns:wne="http://schemas.microsoft.com/office/word/2006/wordml" xmlns:wp14="http://schemas.microsoft.com/office/word/2010/wordprocessingDrawing" xmlns:wp="http://schemas.openxmlformats.org/drawingml/2006/wordprocessingDrawing" xmlns:wpc="http://schemas.microsoft.com/office/word/2010/wordprocessingCanvas" xmlns:wpg="http://schemas.microsoft.com/office/word/2010/wordprocessingGroup" xmlns:wpi="http://schemas.microsoft.com/office/word/2010/wordprocessingInk" xmlns:wps="http://schemas.microsoft.com/office/word/2010/wordprocessingShape" mc:Ignorable="w14 wp14">
+  <w:p>
+    <w:pPr>
+      <w:pStyle w:val="Header"/>
+    </w:pPr>
+  </w:p>
+  <w:tbl>
+    <w:tblPr>
+      <w:tblW w:type="auto" w:w="0"/>
+      <w:tblLayout w:type="fixed"/>
+      <w:tblLook w:firstColumn="1" w:firstRow="1" w:lastColumn="0" w:lastRow="0" w:noHBand="0" w:noVBand="1" w:val="04A0"/>
+    </w:tblPr>
+    <w:tblGrid>
+      <w:gridCol w:w="1440"/>
+      <w:gridCol w:w="7920"/>
+    </w:tblGrid>
+    <w:tr>
+      <w:tc>
+        <w:tcPr>
+          <w:tcW w:type="dxa" w:w="4680"/>
+          <w:tcBorders>
+            <w:top w:val="nil"/>
+            <w:left w:val="nil"/>
+            <w:right w:val="nil"/>
+            <w:bottom w:val="single" w:sz="4" w:color="1A1A1A"/>
+          </w:tcBorders>
+        </w:tcPr>
+        <w:p>
+          <w:r>
+            <w:drawing>
+              <wp:inline xmlns:a="http://schemas.openxmlformats.org/drawingml/2006/main" xmlns:pic="http://schemas.openxmlformats.org/drawingml/2006/picture">
+                <wp:extent cx="594360" cy="58725"/>
+                <wp:docPr id="1" name="Picture 1"/>
+                <wp:cNvGraphicFramePr>
+                  <a:graphicFrameLocks noChangeAspect="1"/>
+                </wp:cNvGraphicFramePr>
+                <a:graphic>
+                  <a:graphicData uri="http://schemas.openxmlformats.org/drawingml/2006/picture">
+                    <pic:pic>
+                      <pic:nvPicPr>
+                        <pic:cNvPr id="0" name="id8_charcoal.png"/>
+                        <pic:cNvPicPr/>
+                      </pic:nvPicPr>
+                      <pic:blipFill>
+                        <a:blip r:embed="rId1"/>
+                        <a:stretch>
+                          <a:fillRect/>
+                        </a:stretch>
+                      </pic:blipFill>
+                      <pic:spPr>
+                        <a:xfrm>
+                          <a:off x="0" y="0"/>
+                          <a:ext cx="594360" cy="58725"/>
+                        </a:xfrm>
+                        <a:prstGeom prst="rect"/>
+                      </pic:spPr>
+                    </pic:pic>
+                  </a:graphicData>
+                </a:graphic>
+              </wp:inline>
+            </w:drawing>
+          </w:r>
+        </w:p>
+      </w:tc>
+      <w:tc>
+        <w:tcPr>
+          <w:tcW w:type="dxa" w:w="4680"/>
+          <w:tcBorders>
+            <w:top w:val="nil"/>
+            <w:left w:val="nil"/>
+            <w:right w:val="nil"/>
+            <w:bottom w:val="single" w:sz="4" w:color="1A1A1A"/>
+          </w:tcBorders>
+        </w:tcPr>
+        <w:p>
+          <w:pPr>
+            <w:spacing w:before="80"/>
+            <w:jc w:val="right"/>
+          </w:pPr>
+          <w:r>
+            <w:rPr>
+              <w:rFonts w:ascii="Sora" w:hAnsi="Sora"/>
+              <w:b w:val="0"/>
+              <w:caps/>
+              <w:color w:val="828282"/>
+              <w:sz w:val="16"/>
+            </w:rPr>
+            <w:t>DEAL SCREEN  ·  ID8 INVESTMENTS  ·  CONFIDENTIAL</w:t>
+          </w:r>
+        </w:p>
+      </w:tc>
+    </w:tr>
+  </w:tbl>
+</w:hdr>
 </file>
 
 <file path=word/numbering.xml><?xml version="1.0" encoding="utf-8"?>

</xml_diff>